<commit_message>
Evidentiraj slanje prijava i pracenje posiljaka
</commit_message>
<xml_diff>
--- a/envelop.docx
+++ b/envelop.docx
@@ -33,13 +33,6 @@
           <w:lang w:val="hr-HR"/>
         </w:rPr>
         <w:br/>
-      </w:r>
-      <w:r>
-        <w:rPr>
-          <w:sz w:val="36"/>
-          <w:szCs w:val="36"/>
-          <w:lang w:val="hr-HR"/>
-        </w:rPr>
         <w:t>Hrvatske šume d.o.o., Ulica kneza Branimira 1, 10000 Zagreb</w:t>
       </w:r>
       <w:r>
@@ -878,6 +871,7 @@
   <w:style w:type="character" w:default="1" w:styleId="DefaultParagraphFont">
     <w:name w:val="Default Paragraph Font"/>
     <w:uiPriority w:val="1"/>
+    <w:semiHidden/>
     <w:unhideWhenUsed/>
   </w:style>
   <w:style w:type="table" w:default="1" w:styleId="TableNormal">

</xml_diff>